<commit_message>
Update tables and some small codes and document links
</commit_message>
<xml_diff>
--- a/material/permanova_schema.docx
+++ b/material/permanova_schema.docx
@@ -66,7 +66,6 @@
               <w:spacing w:after="40"/>
               <w:jc w:val="center"/>
             </w:pPr>
-            <w:proofErr w:type="spellStart"/>
             <w:r>
               <w:rPr>
                 <w:rFonts w:ascii="Arial" w:eastAsia="Arial" w:hAnsi="Arial" w:cs="Arial"/>
@@ -76,43 +75,7 @@
                 <w:sz w:val="18"/>
                 <w:szCs w:val="18"/>
               </w:rPr>
-              <w:t>build_</w:t>
-            </w:r>
-            <w:proofErr w:type="gramStart"/>
-            <w:r>
-              <w:rPr>
-                <w:rFonts w:ascii="Arial" w:eastAsia="Arial" w:hAnsi="Arial" w:cs="Arial"/>
-                <w:b/>
-                <w:bCs/>
-                <w:color w:val="B34700"/>
-                <w:sz w:val="18"/>
-                <w:szCs w:val="18"/>
-              </w:rPr>
-              <w:t>profiles</w:t>
-            </w:r>
-            <w:proofErr w:type="spellEnd"/>
-            <w:r>
-              <w:rPr>
-                <w:rFonts w:ascii="Arial" w:eastAsia="Arial" w:hAnsi="Arial" w:cs="Arial"/>
-                <w:b/>
-                <w:bCs/>
-                <w:color w:val="B34700"/>
-                <w:sz w:val="18"/>
-                <w:szCs w:val="18"/>
-              </w:rPr>
-              <w:t>(</w:t>
-            </w:r>
-            <w:proofErr w:type="gramEnd"/>
-            <w:r>
-              <w:rPr>
-                <w:rFonts w:ascii="Arial" w:eastAsia="Arial" w:hAnsi="Arial" w:cs="Arial"/>
-                <w:b/>
-                <w:bCs/>
-                <w:color w:val="B34700"/>
-                <w:sz w:val="18"/>
-                <w:szCs w:val="18"/>
-              </w:rPr>
-              <w:t>)</w:t>
+              <w:t>build_profiles()</w:t>
             </w:r>
           </w:p>
           <w:p>
@@ -136,27 +99,7 @@
                 <w:sz w:val="18"/>
                 <w:szCs w:val="18"/>
               </w:rPr>
-              <w:t>[</w:t>
-            </w:r>
-            <w:proofErr w:type="gramStart"/>
-            <w:r>
-              <w:rPr>
-                <w:rFonts w:ascii="Arial" w:eastAsia="Arial" w:hAnsi="Arial" w:cs="Arial"/>
-                <w:color w:val="B34700"/>
-                <w:sz w:val="18"/>
-                <w:szCs w:val="18"/>
-              </w:rPr>
-              <w:t>A,B</w:t>
-            </w:r>
-            <w:proofErr w:type="gramEnd"/>
-            <w:r>
-              <w:rPr>
-                <w:rFonts w:ascii="Arial" w:eastAsia="Arial" w:hAnsi="Arial" w:cs="Arial"/>
-                <w:color w:val="B34700"/>
-                <w:sz w:val="18"/>
-                <w:szCs w:val="18"/>
-              </w:rPr>
-              <w:t xml:space="preserve">,C] </w:t>
+              <w:t xml:space="preserve">[A,B,C] </w:t>
             </w:r>
             <w:r>
               <w:rPr>
@@ -385,7 +328,6 @@
                   </w:tcMar>
                 </w:tcPr>
                 <w:p>
-                  <w:proofErr w:type="spellStart"/>
                   <w:r>
                     <w:rPr>
                       <w:rFonts w:ascii="Arial" w:eastAsia="Arial" w:hAnsi="Arial" w:cs="Arial"/>
@@ -397,7 +339,6 @@
                     </w:rPr>
                     <w:t>A__High</w:t>
                   </w:r>
-                  <w:proofErr w:type="spellEnd"/>
                 </w:p>
               </w:tc>
               <w:tc>
@@ -519,7 +460,6 @@
                   </w:tcMar>
                 </w:tcPr>
                 <w:p>
-                  <w:proofErr w:type="spellStart"/>
                   <w:r>
                     <w:rPr>
                       <w:rFonts w:ascii="Arial" w:eastAsia="Arial" w:hAnsi="Arial" w:cs="Arial"/>
@@ -531,7 +471,6 @@
                     </w:rPr>
                     <w:t>A__Low</w:t>
                   </w:r>
-                  <w:proofErr w:type="spellEnd"/>
                 </w:p>
               </w:tc>
               <w:tc>
@@ -653,7 +592,6 @@
                   </w:tcMar>
                 </w:tcPr>
                 <w:p>
-                  <w:proofErr w:type="spellStart"/>
                   <w:r>
                     <w:rPr>
                       <w:rFonts w:ascii="Arial" w:eastAsia="Arial" w:hAnsi="Arial" w:cs="Arial"/>
@@ -665,7 +603,6 @@
                     </w:rPr>
                     <w:t>B__High</w:t>
                   </w:r>
-                  <w:proofErr w:type="spellEnd"/>
                 </w:p>
               </w:tc>
               <w:tc>
@@ -787,7 +724,6 @@
                   </w:tcMar>
                 </w:tcPr>
                 <w:p>
-                  <w:proofErr w:type="spellStart"/>
                   <w:r>
                     <w:rPr>
                       <w:rFonts w:ascii="Arial" w:eastAsia="Arial" w:hAnsi="Arial" w:cs="Arial"/>
@@ -799,7 +735,6 @@
                     </w:rPr>
                     <w:t>B__Low</w:t>
                   </w:r>
-                  <w:proofErr w:type="spellEnd"/>
                 </w:p>
               </w:tc>
               <w:tc>
@@ -921,7 +856,6 @@
                   </w:tcMar>
                 </w:tcPr>
                 <w:p>
-                  <w:proofErr w:type="spellStart"/>
                   <w:r>
                     <w:rPr>
                       <w:rFonts w:ascii="Arial" w:eastAsia="Arial" w:hAnsi="Arial" w:cs="Arial"/>
@@ -933,7 +867,6 @@
                     </w:rPr>
                     <w:t>C__High</w:t>
                   </w:r>
-                  <w:proofErr w:type="spellEnd"/>
                 </w:p>
               </w:tc>
               <w:tc>
@@ -1055,7 +988,6 @@
                   </w:tcMar>
                 </w:tcPr>
                 <w:p>
-                  <w:proofErr w:type="spellStart"/>
                   <w:r>
                     <w:rPr>
                       <w:rFonts w:ascii="Arial" w:eastAsia="Arial" w:hAnsi="Arial" w:cs="Arial"/>
@@ -1067,7 +999,6 @@
                     </w:rPr>
                     <w:t>C__Low</w:t>
                   </w:r>
-                  <w:proofErr w:type="spellEnd"/>
                 </w:p>
               </w:tc>
               <w:tc>
@@ -1277,7 +1208,6 @@
               <w:spacing w:after="40"/>
               <w:jc w:val="center"/>
             </w:pPr>
-            <w:proofErr w:type="spellStart"/>
             <w:r>
               <w:rPr>
                 <w:rFonts w:ascii="Arial" w:eastAsia="Arial" w:hAnsi="Arial" w:cs="Arial"/>
@@ -1287,19 +1217,7 @@
                 <w:sz w:val="18"/>
                 <w:szCs w:val="18"/>
               </w:rPr>
-              <w:t>vegdist</w:t>
-            </w:r>
-            <w:proofErr w:type="spellEnd"/>
-            <w:r>
-              <w:rPr>
-                <w:rFonts w:ascii="Arial" w:eastAsia="Arial" w:hAnsi="Arial" w:cs="Arial"/>
-                <w:b/>
-                <w:bCs/>
-                <w:color w:val="B34700"/>
-                <w:sz w:val="18"/>
-                <w:szCs w:val="18"/>
-              </w:rPr>
-              <w:t>("bray")</w:t>
+              <w:t>vegdist("bray")</w:t>
             </w:r>
           </w:p>
           <w:p>
@@ -2085,7 +2003,6 @@
                     <w:spacing w:after="40"/>
                     <w:jc w:val="center"/>
                   </w:pPr>
-                  <w:proofErr w:type="gramStart"/>
                   <w:r>
                     <w:rPr>
                       <w:rFonts w:ascii="Arial" w:eastAsia="Arial" w:hAnsi="Arial" w:cs="Arial"/>
@@ -2104,7 +2021,6 @@
                     </w:rPr>
                     <w:t>(</w:t>
                   </w:r>
-                  <w:proofErr w:type="gramEnd"/>
                   <w:r>
                     <w:rPr>
                       <w:rFonts w:ascii="Arial" w:eastAsia="Arial" w:hAnsi="Arial" w:cs="Arial"/>
@@ -2149,7 +2065,6 @@
                     <w:spacing w:after="40"/>
                     <w:jc w:val="center"/>
                   </w:pPr>
-                  <w:proofErr w:type="gramStart"/>
                   <w:r>
                     <w:rPr>
                       <w:rFonts w:ascii="Arial" w:eastAsia="Arial" w:hAnsi="Arial" w:cs="Arial"/>
@@ -2168,7 +2083,6 @@
                     </w:rPr>
                     <w:t>(</w:t>
                   </w:r>
-                  <w:proofErr w:type="gramEnd"/>
                   <w:r>
                     <w:rPr>
                       <w:rFonts w:ascii="Arial" w:eastAsia="Arial" w:hAnsi="Arial" w:cs="Arial"/>
@@ -2713,8 +2627,6 @@
               <w:spacing w:after="100"/>
               <w:jc w:val="center"/>
             </w:pPr>
-            <w:proofErr w:type="spellStart"/>
-            <w:proofErr w:type="gramStart"/>
             <w:r>
               <w:rPr>
                 <w:rFonts w:ascii="Arial" w:eastAsia="Arial" w:hAnsi="Arial" w:cs="Arial"/>
@@ -2726,7 +2638,6 @@
               </w:rPr>
               <w:t>betadisper</w:t>
             </w:r>
-            <w:proofErr w:type="spellEnd"/>
             <w:r>
               <w:rPr>
                 <w:rFonts w:ascii="Arial" w:eastAsia="Arial" w:hAnsi="Arial" w:cs="Arial"/>
@@ -2736,19 +2647,7 @@
                 <w:sz w:val="18"/>
                 <w:szCs w:val="18"/>
               </w:rPr>
-              <w:t>(</w:t>
-            </w:r>
-            <w:proofErr w:type="gramEnd"/>
-            <w:r>
-              <w:rPr>
-                <w:rFonts w:ascii="Arial" w:eastAsia="Arial" w:hAnsi="Arial" w:cs="Arial"/>
-                <w:b/>
-                <w:bCs/>
-                <w:color w:val="B34700"/>
-                <w:sz w:val="18"/>
-                <w:szCs w:val="18"/>
-              </w:rPr>
-              <w:t>)</w:t>
+              <w:t>()</w:t>
             </w:r>
           </w:p>
           <w:p>
@@ -5112,4 +5011,16 @@
     </a:ext>
   </a:extLst>
 </a:theme>
+</file>
+
+<file path=customXml/item1.xml><?xml version="1.0" encoding="utf-8"?>
+<b:Sources xmlns:b="http://schemas.openxmlformats.org/officeDocument/2006/bibliography" xmlns="http://schemas.openxmlformats.org/officeDocument/2006/bibliography" SelectedStyle="\APASixthEditionOfficeOnline.xsl" StyleName="APA" Version="6"/>
+</file>
+
+<file path=customXml/itemProps1.xml><?xml version="1.0" encoding="utf-8"?>
+<ds:datastoreItem xmlns:ds="http://schemas.openxmlformats.org/officeDocument/2006/customXml" ds:itemID="{C401A183-8DF2-4104-BE75-8B7B04EA1E20}">
+  <ds:schemaRefs>
+    <ds:schemaRef ds:uri="http://schemas.openxmlformats.org/officeDocument/2006/bibliography"/>
+  </ds:schemaRefs>
+</ds:datastoreItem>
 </file>
</xml_diff>